<commit_message>
Simplify Labs 01/02 to RHA-only, no GitHub submission
Grading for Containers and Automation is entirely on the RHA side, so
the parallel GitHub submission/autograder infra (Containerfile stub,
Molecule tests, CI workflows) was redundant complexity for a component
that doesn't count toward the grade. Both labs are now instructions-only
READMEs pointing to the RHA lab. Lecture 3 and the syllabus updated to
match.

Co-Authored-By: Claude Sonnet 5 <noreply@anthropic.com>
Claude-Session: https://claude.ai/code/session_011nUiNHpD2x41N3YxSVW2Vt
</commit_message>
<xml_diff>
--- a/INF345_Syllabus_DevOps_I_Akhmetov_Adil.docx
+++ b/INF345_Syllabus_DevOps_I_Akhmetov_Adil.docx
@@ -1952,7 +1952,7 @@
           <w:highlight w:val="white"/>
           <w:rtl w:val="0"/>
         </w:rPr>
-        <w:t>An introduction to DevOps practice through its two most foundational disciplines: containers and configuration-management automation. Students containerize real applications, automate infrastructure with Ansible, and build a CI/CD pipeline — the core skills used in production software engineering today. The course runs partly on Red Hat Academy cloud labs (provided free to SDU students through the university's Red Hat Academy partnership) and partly on open-source tooling students can keep using without any subscription. Every lab is graded automatically within minutes of submission via GitHub Classroom.</w:t>
+        <w:t>An introduction to DevOps practice through its two most foundational disciplines: containers and configuration-management automation. Students containerize real applications, automate infrastructure with Ansible, and build a CI/CD pipeline — the core skills used in production software engineering today. The course runs partly on Red Hat Academy cloud labs (provided free to SDU students through the university's Red Hat Academy partnership) and partly on open-source tooling students can keep using without any subscription. Containers and Automation are graded directly from Red Hat Academy lab completion; the CI/CD lab and the capstone are graded automatically within minutes of submission via GitHub Classroom.</w:t>
       </w:r>
       <w:r>
         <w:rPr>
@@ -5499,7 +5499,7 @@
                 <w:b w:val="0"/>
                 <w:sz w:val="24"/>
               </w:rPr>
-              <w:t>Graded from RHA DO188 lab completion (instructor-assigned via RHA portal); GitHub submission is ungraded practice/portfolio</w:t>
+              <w:t>Graded entirely from RHA DO188 lab completion (instructor-assigned via RHA portal) — no GitHub submission</w:t>
             </w:r>
           </w:p>
         </w:tc>
@@ -5590,7 +5590,7 @@
                 <w:b w:val="0"/>
                 <w:sz w:val="24"/>
               </w:rPr>
-              <w:t>Graded from RHA RH294 lab completion (instructor-assigned via RHA portal); GitHub submission is ungraded practice/portfolio</w:t>
+              <w:t>Graded entirely from RHA RH294 lab completion (instructor-assigned via RHA portal) — no GitHub submission</w:t>
             </w:r>
           </w:p>
         </w:tc>

</xml_diff>

<commit_message>
Add Lecture 2 (Git & GitHub) + Practice 2, rebalance grading, enable PDF export
- Lecture 2: Git fundamentals, branching, GitHub workflow, curated
  learning resources, live monaco-diff demo.
- Practice 2: a real 3-commit exercise with a lightweight (no-build)
  GitHub Actions autograder, plus practices/README.md documenting the
  practice-session automation pattern (fast checks only, doubles as
  attendance signal).
- Grading rebalanced to include Attendance (5%) and Weekly Practice (10%)
  without touching Labs (45%) or the Final Exam/Capstone (40%).
- All lecture decks now export to PDF by default (download: true) plus
  dedicated `npm run export:01/02/03/all` scripts.

Co-Authored-By: Claude Sonnet 5 <noreply@anthropic.com>
Claude-Session: https://claude.ai/code/session_011nUiNHpD2x41N3YxSVW2Vt
</commit_message>
<xml_diff>
--- a/INF345_Syllabus_DevOps_I_Akhmetov_Adil.docx
+++ b/INF345_Syllabus_DevOps_I_Akhmetov_Adil.docx
@@ -5772,7 +5772,7 @@
                 <w:b w:val="0"/>
                 <w:sz w:val="24"/>
               </w:rPr>
-              <w:t>1-hour in-class practice exercise each lesson</w:t>
+              <w:t>1-hour in-class exercise each lesson, autograded via GitHub Classroom</w:t>
             </w:r>
           </w:p>
         </w:tc>
@@ -5814,7 +5814,98 @@
                 <w:b w:val="0"/>
                 <w:sz w:val="24"/>
               </w:rPr>
-              <w:t>15</w:t>
+              <w:t>10</w:t>
+            </w:r>
+          </w:p>
+        </w:tc>
+      </w:tr>
+      <w:tr>
+        <w:trPr>
+          <w:cantSplit w:val="0"/>
+          <w:tblHeader w:val="0"/>
+        </w:trPr>
+        <w:tc>
+          <w:tcPr>
+            <w:tcBorders>
+              <w:top w:color="000000" w:space="0" w:sz="8" w:val="single"/>
+              <w:left w:color="000000" w:space="0" w:sz="8" w:val="single"/>
+              <w:bottom w:color="000000" w:space="0" w:sz="8" w:val="single"/>
+              <w:right w:color="000000" w:space="0" w:sz="8" w:val="single"/>
+            </w:tcBorders>
+            <w:shd w:fill="auto" w:val="clear"/>
+          </w:tcPr>
+          <w:p>
+            <w:r/>
+            <w:r>
+              <w:rPr>
+                <w:rFonts w:ascii="Times New Roman" w:hAnsi="Times New Roman" w:cs="Times New Roman" w:eastAsia="Times New Roman"/>
+                <w:b w:val="0"/>
+                <w:sz w:val="24"/>
+              </w:rPr>
+              <w:t>Attendance</w:t>
+            </w:r>
+          </w:p>
+        </w:tc>
+        <w:tc>
+          <w:tcPr>
+            <w:tcBorders>
+              <w:top w:color="000000" w:space="0" w:sz="8" w:val="single"/>
+              <w:left w:color="000000" w:space="0" w:sz="8" w:val="single"/>
+              <w:bottom w:color="000000" w:space="0" w:sz="8" w:val="single"/>
+              <w:right w:color="000000" w:space="0" w:sz="8" w:val="single"/>
+            </w:tcBorders>
+          </w:tcPr>
+          <w:p>
+            <w:r/>
+            <w:r>
+              <w:rPr>
+                <w:rFonts w:ascii="Times New Roman" w:hAnsi="Times New Roman" w:cs="Times New Roman" w:eastAsia="Times New Roman"/>
+                <w:b w:val="0"/>
+                <w:sz w:val="24"/>
+              </w:rPr>
+              <w:t>Present and participating in lecture + practice</w:t>
+            </w:r>
+          </w:p>
+        </w:tc>
+        <w:tc>
+          <w:tcPr>
+            <w:tcBorders>
+              <w:top w:color="000000" w:space="0" w:sz="8" w:val="single"/>
+              <w:left w:color="000000" w:space="0" w:sz="8" w:val="single"/>
+              <w:bottom w:color="000000" w:space="0" w:sz="8" w:val="single"/>
+              <w:right w:color="000000" w:space="0" w:sz="8" w:val="single"/>
+            </w:tcBorders>
+          </w:tcPr>
+          <w:p>
+            <w:r/>
+            <w:r>
+              <w:rPr>
+                <w:rFonts w:ascii="Times New Roman" w:hAnsi="Times New Roman" w:cs="Times New Roman" w:eastAsia="Times New Roman"/>
+                <w:b w:val="0"/>
+                <w:sz w:val="24"/>
+              </w:rPr>
+              <w:t>~15</w:t>
+            </w:r>
+          </w:p>
+        </w:tc>
+        <w:tc>
+          <w:tcPr>
+            <w:tcBorders>
+              <w:top w:color="000000" w:space="0" w:sz="8" w:val="single"/>
+              <w:left w:color="000000" w:space="0" w:sz="8" w:val="single"/>
+              <w:bottom w:color="000000" w:space="0" w:sz="8" w:val="single"/>
+              <w:right w:color="000000" w:space="0" w:sz="8" w:val="single"/>
+            </w:tcBorders>
+          </w:tcPr>
+          <w:p>
+            <w:r/>
+            <w:r>
+              <w:rPr>
+                <w:rFonts w:ascii="Times New Roman" w:hAnsi="Times New Roman" w:cs="Times New Roman" w:eastAsia="Times New Roman"/>
+                <w:b w:val="0"/>
+                <w:sz w:val="24"/>
+              </w:rPr>
+              <w:t>5</w:t>
             </w:r>
           </w:p>
         </w:tc>

</xml_diff>